<commit_message>
feat: actualizar calculo de variacion y ajustes de UI/Docs
</commit_message>
<xml_diff>
--- a/docs/GUIA_RAPIDA_USUARIO.docx
+++ b/docs/GUIA_RAPIDA_USUARIO.docx
@@ -18,7 +18,7 @@
       <w:r>
         <w:t>Aplicación de Planificación y Proyección de Faena Avícola</w:t>
         <w:br/>
-        <w:t>Versión 1.0</w:t>
+        <w:t>Versión 1.1</w:t>
       </w:r>
     </w:p>
     <w:p>
@@ -480,6 +480,234 @@
         <w:t>Acumular Déficit: Si por superar los límites máximos diarios permitidos de la planta (42.000 aves) no hay capacidad para reasignar todos los lotes de un feriado, estos lotes quedarán marcados como "Lotes No Asignados" o "Déficit". El usuario podrá guardar este déficit para que sean programados como prioridad alta durante la siguiente semana activa de faena.</w:t>
       </w:r>
     </w:p>
+    <w:p>
+      <w:r>
+        <w:rPr>
+          <w:b/>
+          <w:color w:val="0EA5E9"/>
+          <w:sz w:val="28"/>
+        </w:rPr>
+        <w:t>8. Compra de Pollos a Terceros</w:t>
+      </w:r>
+    </w:p>
+    <w:p>
+      <w:r>
+        <w:rPr>
+          <w:b/>
+        </w:rPr>
+        <w:t>¿Qué es y para qué sirve?</w:t>
+      </w:r>
+    </w:p>
+    <w:p>
+      <w:r>
+        <w:t>Cuando la oferta propia de granjas no alcanza para cubrir el objetivo semanal de faena, el sistema permite registrar compras de pollos a proveedores externos (terceros). Estos lotes se integran a la proyección semanal como cualquier otro lote, pero quedan identificados visualmente con un badge púrpura para diferenciarlos de los lotes propios.</w:t>
+      </w:r>
+    </w:p>
+    <w:p>
+      <w:r>
+        <w:rPr>
+          <w:b/>
+        </w:rPr>
+        <w:t>¿Cómo se utiliza?</w:t>
+      </w:r>
+    </w:p>
+    <w:p>
+      <w:pPr>
+        <w:pStyle w:val="ListBullet"/>
+      </w:pPr>
+      <w:r>
+        <w:rPr>
+          <w:b/>
+        </w:rPr>
+        <w:t xml:space="preserve">Detección automática de déficit: </w:t>
+      </w:r>
+      <w:r>
+        <w:t>Al generar la proyección, si algún día queda por debajo del objetivo mínimo diario, el sistema muestra un banner púrpura en la pestaña Proyección indicando cuántos pollos faltan y en qué días.</w:t>
+      </w:r>
+    </w:p>
+    <w:p>
+      <w:pPr>
+        <w:pStyle w:val="ListBullet"/>
+      </w:pPr>
+      <w:r>
+        <w:rPr>
+          <w:b/>
+        </w:rPr>
+        <w:t xml:space="preserve">Agregar lote de terceros: </w:t>
+      </w:r>
+      <w:r>
+        <w:t>Desde el banner o desde el botón “Compra Terceros” en la barra de herramientas, se abre un formulario donde se ingresa: proveedor, cantidad, sexo, edad, peso, ganancia diaria, fechas y motivo de compra. El lote se asigna al día seleccionado.</w:t>
+      </w:r>
+    </w:p>
+    <w:p>
+      <w:pPr>
+        <w:pStyle w:val="ListBullet"/>
+      </w:pPr>
+      <w:r>
+        <w:rPr>
+          <w:b/>
+        </w:rPr>
+        <w:t xml:space="preserve">Identificación visual: </w:t>
+      </w:r>
+      <w:r>
+        <w:t>Los lotes de terceros aparecen con un badge púrpura “Terceros” tanto en la vista de tarjetas como en la vista de tabla. El motivo de compra se muestra en cursiva debajo del detalle del lote.</w:t>
+      </w:r>
+    </w:p>
+    <w:p>
+      <w:pPr>
+        <w:pStyle w:val="ListBullet"/>
+      </w:pPr>
+      <w:r>
+        <w:rPr>
+          <w:b/>
+        </w:rPr>
+        <w:t xml:space="preserve">Reporte en Resumen: </w:t>
+      </w:r>
+      <w:r>
+        <w:t>En la pestaña Resumen aparece automáticamente una sección “Compra a Terceros” con estadísticas (total pollos, porcentaje del total semanal, peso promedio ponderado, cajas) y una tabla con el detalle por día y proveedor.</w:t>
+      </w:r>
+    </w:p>
+    <w:p>
+      <w:r>
+        <w:rPr>
+          <w:b/>
+          <w:color w:val="0EA5E9"/>
+          <w:sz w:val="28"/>
+        </w:rPr>
+        <w:t>9. Peso Objetivo de Recepción y Recomendación Óptima</w:t>
+      </w:r>
+    </w:p>
+    <w:p>
+      <w:r>
+        <w:rPr>
+          <w:b/>
+        </w:rPr>
+        <w:t>¿Qué es y para qué sirve?</w:t>
+      </w:r>
+    </w:p>
+    <w:p>
+      <w:r>
+        <w:t>El sistema permite establecer un peso objetivo de recepción en frigorífico (por defecto 2,85 kg). Cuando los pesos reales recibidos están por debajo de este objetivo, el sistema calcula automáticamente cuántos kilos se pierden y cuántos pollos adicionales se necesitarían para compensar el déficit, evaluando si la planta puede absorberlos con o sin horas extras, o si se requiere compra a terceros.</w:t>
+      </w:r>
+    </w:p>
+    <w:p>
+      <w:r>
+        <w:rPr>
+          <w:b/>
+        </w:rPr>
+        <w:t>¿Cómo se configura?</w:t>
+      </w:r>
+    </w:p>
+    <w:p>
+      <w:pPr>
+        <w:pStyle w:val="ListBullet"/>
+      </w:pPr>
+      <w:r>
+        <w:t xml:space="preserve">Vaya a la pestaña Parámetros. En la sección “Objetivos de Recepción” configure el </w:t>
+      </w:r>
+      <w:r>
+        <w:rPr>
+          <w:b/>
+        </w:rPr>
+        <w:t>Peso objetivo recepción (kg)</w:t>
+      </w:r>
+      <w:r>
+        <w:t>.</w:t>
+      </w:r>
+    </w:p>
+    <w:p>
+      <w:pPr>
+        <w:pStyle w:val="ListBullet"/>
+      </w:pPr>
+      <w:r>
+        <w:t xml:space="preserve">En la sección “Producción y Capacidad” configure la </w:t>
+      </w:r>
+      <w:r>
+        <w:rPr>
+          <w:b/>
+        </w:rPr>
+        <w:t>Capacidad máx. con horas extras</w:t>
+      </w:r>
+      <w:r>
+        <w:t xml:space="preserve"> (por defecto 45.000 aves). Este valor es la capacidad real máxima incluyendo horas extras.</w:t>
+      </w:r>
+    </w:p>
+    <w:p>
+      <w:r>
+        <w:rPr>
+          <w:b/>
+        </w:rPr>
+        <w:t>¿Cómo se utiliza?</w:t>
+      </w:r>
+    </w:p>
+    <w:p>
+      <w:pPr>
+        <w:pStyle w:val="ListBullet"/>
+      </w:pPr>
+      <w:r>
+        <w:rPr>
+          <w:b/>
+        </w:rPr>
+        <w:t xml:space="preserve">Cargar pesos reales: </w:t>
+      </w:r>
+      <w:r>
+        <w:t>En la pestaña Desvíos, ingrese el peso promedio real recibido para cada día y presione “Guardar Pesos Reales”.</w:t>
+      </w:r>
+    </w:p>
+    <w:p>
+      <w:pPr>
+        <w:pStyle w:val="ListBullet"/>
+      </w:pPr>
+      <w:r>
+        <w:rPr>
+          <w:b/>
+        </w:rPr>
+        <w:t xml:space="preserve">Recomendación automática: </w:t>
+      </w:r>
+      <w:r>
+        <w:t>Debajo de la tabla de desvíos aparece la sección “Recomendación Óptima” que muestra:</w:t>
+      </w:r>
+    </w:p>
+    <w:p>
+      <w:pPr>
+        <w:pStyle w:val="ListBullet"/>
+      </w:pPr>
+      <w:r>
+        <w:t xml:space="preserve">   - Kg de déficit total estimado por menor peso.</w:t>
+      </w:r>
+    </w:p>
+    <w:p>
+      <w:pPr>
+        <w:pStyle w:val="ListBullet"/>
+      </w:pPr>
+      <w:r>
+        <w:t xml:space="preserve">   - Cantidad de pollos de compensación necesarios.</w:t>
+      </w:r>
+    </w:p>
+    <w:p>
+      <w:pPr>
+        <w:pStyle w:val="ListBullet"/>
+      </w:pPr>
+      <w:r>
+        <w:t xml:space="preserve">   - Si la planta puede absorberlos sin horas extras, con horas extras, o si se requiere compra a terceros.</w:t>
+      </w:r>
+    </w:p>
+    <w:p>
+      <w:pPr>
+        <w:pStyle w:val="ListBullet"/>
+      </w:pPr>
+      <w:r>
+        <w:t xml:space="preserve">   - Detalle por día con margen disponible en cada escenario.</w:t>
+      </w:r>
+    </w:p>
+    <w:p>
+      <w:pPr>
+        <w:pStyle w:val="ListBullet"/>
+      </w:pPr>
+      <w:r>
+        <w:t xml:space="preserve">   - Alerta para Comercial sobre calibres más chicos de lo esperado.</w:t>
+      </w:r>
+    </w:p>
     <w:sectPr>
       <w:pgSz w:w="12240" w:h="15840"/>
       <w:pgMar w:top="1440" w:right="1800" w:bottom="1440" w:left="1800" w:header="720" w:footer="720" w:gutter="0"/>

</xml_diff>